<commit_message>
Part 7 - Revised
</commit_message>
<xml_diff>
--- a/memory-bugs/Cmpsc473_Project1_Part7.docx
+++ b/memory-bugs/Cmpsc473_Project1_Part7.docx
@@ -460,15 +460,7 @@
                 <w:sz w:val="22"/>
                 <w:szCs w:val="22"/>
               </w:rPr>
-              <w:t>initialize_</w:t>
-            </w:r>
-            <w:proofErr w:type="gramStart"/>
-            <w:r>
-              <w:rPr>
-                <w:sz w:val="22"/>
-                <w:szCs w:val="22"/>
-              </w:rPr>
-              <w:t>prefix</w:t>
+              <w:t>initialize_prefix</w:t>
             </w:r>
             <w:proofErr w:type="spellEnd"/>
             <w:r>
@@ -476,15 +468,7 @@
                 <w:sz w:val="22"/>
                 <w:szCs w:val="22"/>
               </w:rPr>
-              <w:t>(</w:t>
-            </w:r>
-            <w:proofErr w:type="gramEnd"/>
-            <w:r>
-              <w:rPr>
-                <w:sz w:val="22"/>
-                <w:szCs w:val="22"/>
-              </w:rPr>
-              <w:t>a, n - 1);</w:t>
+              <w:t>(a, n - 1);</w:t>
             </w:r>
           </w:p>
           <w:p>
@@ -502,7 +486,6 @@
               <w:t xml:space="preserve"> </w:t>
             </w:r>
             <w:proofErr w:type="spellStart"/>
-            <w:proofErr w:type="gramStart"/>
             <w:r>
               <w:rPr>
                 <w:sz w:val="22"/>
@@ -516,63 +499,7 @@
                 <w:sz w:val="22"/>
                 <w:szCs w:val="22"/>
               </w:rPr>
-              <w:t>(</w:t>
-            </w:r>
-            <w:proofErr w:type="gramEnd"/>
-            <w:r>
-              <w:rPr>
-                <w:sz w:val="22"/>
-                <w:szCs w:val="22"/>
-              </w:rPr>
-              <w:t xml:space="preserve">"test2: %d\n", </w:t>
-            </w:r>
-            <w:proofErr w:type="gramStart"/>
-            <w:r>
-              <w:rPr>
-                <w:sz w:val="22"/>
-                <w:szCs w:val="22"/>
-              </w:rPr>
-              <w:t>a[</w:t>
-            </w:r>
-            <w:proofErr w:type="gramEnd"/>
-            <w:r>
-              <w:rPr>
-                <w:sz w:val="22"/>
-                <w:szCs w:val="22"/>
-              </w:rPr>
-              <w:t xml:space="preserve">0] + </w:t>
-            </w:r>
-            <w:proofErr w:type="gramStart"/>
-            <w:r>
-              <w:rPr>
-                <w:sz w:val="22"/>
-                <w:szCs w:val="22"/>
-              </w:rPr>
-              <w:t>a[</w:t>
-            </w:r>
-            <w:proofErr w:type="gramEnd"/>
-            <w:r>
-              <w:rPr>
-                <w:sz w:val="22"/>
-                <w:szCs w:val="22"/>
-              </w:rPr>
-              <w:t xml:space="preserve">1] + </w:t>
-            </w:r>
-            <w:proofErr w:type="gramStart"/>
-            <w:r>
-              <w:rPr>
-                <w:sz w:val="22"/>
-                <w:szCs w:val="22"/>
-              </w:rPr>
-              <w:t>a[</w:t>
-            </w:r>
-            <w:proofErr w:type="gramEnd"/>
-            <w:r>
-              <w:rPr>
-                <w:sz w:val="22"/>
-                <w:szCs w:val="22"/>
-              </w:rPr>
-              <w:t>n - 1]);</w:t>
+              <w:t>("test2: %d\n", a[0] + a[1] + a[n - 1]);</w:t>
             </w:r>
           </w:p>
         </w:tc>
@@ -644,7 +571,6 @@
               <w:t>(</w:t>
             </w:r>
             <w:proofErr w:type="spellStart"/>
-            <w:proofErr w:type="gramStart"/>
             <w:r>
               <w:rPr>
                 <w:i/>
@@ -655,7 +581,6 @@
               <w:t>a,n</w:t>
             </w:r>
             <w:proofErr w:type="spellEnd"/>
-            <w:proofErr w:type="gramEnd"/>
             <w:r>
               <w:rPr>
                 <w:i/>
@@ -768,7 +693,6 @@
               <w:t xml:space="preserve">    </w:t>
             </w:r>
             <w:proofErr w:type="spellStart"/>
-            <w:proofErr w:type="gramStart"/>
             <w:r>
               <w:rPr>
                 <w:sz w:val="22"/>
@@ -782,15 +706,7 @@
                 <w:sz w:val="22"/>
                 <w:szCs w:val="22"/>
               </w:rPr>
-              <w:t>(</w:t>
-            </w:r>
-            <w:proofErr w:type="gramEnd"/>
-            <w:r>
-              <w:rPr>
-                <w:sz w:val="22"/>
-                <w:szCs w:val="22"/>
-              </w:rPr>
-              <w:t>"test3: %d\n", *p);</w:t>
+              <w:t>("test3: %d\n", *p);</w:t>
             </w:r>
           </w:p>
         </w:tc>
@@ -843,7 +759,6 @@
               </w:rPr>
             </w:pPr>
             <w:proofErr w:type="spellStart"/>
-            <w:proofErr w:type="gramStart"/>
             <w:r>
               <w:rPr>
                 <w:i/>
@@ -861,17 +776,7 @@
                 <w:sz w:val="22"/>
                 <w:szCs w:val="22"/>
               </w:rPr>
-              <w:t>(</w:t>
-            </w:r>
-            <w:proofErr w:type="gramEnd"/>
-            <w:r>
-              <w:rPr>
-                <w:i/>
-                <w:iCs/>
-                <w:sz w:val="22"/>
-                <w:szCs w:val="22"/>
-              </w:rPr>
-              <w:t xml:space="preserve">"test3: %d\n", *p); </w:t>
+              <w:t xml:space="preserve">("test3: %d\n", *p); </w:t>
             </w:r>
             <w:proofErr w:type="spellStart"/>
             <w:r>
@@ -961,15 +866,7 @@
                 <w:sz w:val="22"/>
                 <w:szCs w:val="22"/>
               </w:rPr>
-              <w:t>make_</w:t>
-            </w:r>
-            <w:proofErr w:type="gramStart"/>
-            <w:r>
-              <w:rPr>
-                <w:sz w:val="22"/>
-                <w:szCs w:val="22"/>
-              </w:rPr>
-              <w:t>message</w:t>
+              <w:t>make_message</w:t>
             </w:r>
             <w:proofErr w:type="spellEnd"/>
             <w:r>
@@ -977,15 +874,7 @@
                 <w:sz w:val="22"/>
                 <w:szCs w:val="22"/>
               </w:rPr>
-              <w:t>(</w:t>
-            </w:r>
-            <w:proofErr w:type="gramEnd"/>
-            <w:r>
-              <w:rPr>
-                <w:sz w:val="22"/>
-                <w:szCs w:val="22"/>
-              </w:rPr>
-              <w:t>);</w:t>
+              <w:t>();</w:t>
             </w:r>
           </w:p>
           <w:p>
@@ -996,7 +885,6 @@
               </w:rPr>
             </w:pPr>
             <w:proofErr w:type="spellStart"/>
-            <w:proofErr w:type="gramStart"/>
             <w:r>
               <w:rPr>
                 <w:sz w:val="22"/>
@@ -1010,15 +898,7 @@
                 <w:sz w:val="22"/>
                 <w:szCs w:val="22"/>
               </w:rPr>
-              <w:t>(</w:t>
-            </w:r>
-            <w:proofErr w:type="gramEnd"/>
-            <w:r>
-              <w:rPr>
-                <w:sz w:val="22"/>
-                <w:szCs w:val="22"/>
-              </w:rPr>
-              <w:t>"test4: %s\n", message);</w:t>
+              <w:t>("test4: %s\n", message);</w:t>
             </w:r>
           </w:p>
         </w:tc>
@@ -1160,23 +1040,7 @@
           <w:sz w:val="22"/>
           <w:szCs w:val="22"/>
         </w:rPr>
-        <w:t xml:space="preserve"> --leak-check=full --show-leak-kinds=all --track-origins=</w:t>
-      </w:r>
-      <w:proofErr w:type="gramStart"/>
-      <w:r>
-        <w:rPr>
-          <w:sz w:val="22"/>
-          <w:szCs w:val="22"/>
-        </w:rPr>
-        <w:t>yes .</w:t>
-      </w:r>
-      <w:proofErr w:type="gramEnd"/>
-      <w:r>
-        <w:rPr>
-          <w:sz w:val="22"/>
-          <w:szCs w:val="22"/>
-        </w:rPr>
-        <w:t>/memory-bugs</w:t>
+        <w:t xml:space="preserve"> --leak-check=full --show-leak-kinds=all --track-origins=yes ./memory-bugs</w:t>
       </w:r>
       <w:r>
         <w:rPr>
@@ -1196,6 +1060,413 @@
         <w:t>testnum</w:t>
       </w:r>
       <w:proofErr w:type="spellEnd"/>
+    </w:p>
+    <w:p>
+      <w:pPr>
+        <w:rPr>
+          <w:sz w:val="22"/>
+          <w:szCs w:val="22"/>
+        </w:rPr>
+      </w:pPr>
+      <w:r>
+        <w:rPr>
+          <w:sz w:val="22"/>
+          <w:szCs w:val="22"/>
+        </w:rPr>
+        <w:t>Test 1:</w:t>
+      </w:r>
+    </w:p>
+    <w:p>
+      <w:pPr>
+        <w:rPr>
+          <w:sz w:val="22"/>
+          <w:szCs w:val="22"/>
+        </w:rPr>
+      </w:pPr>
+      <w:r>
+        <w:rPr>
+          <w:sz w:val="22"/>
+          <w:szCs w:val="22"/>
+        </w:rPr>
+        <w:t>==4769== Invalid write of size 4</w:t>
+      </w:r>
+    </w:p>
+    <w:p>
+      <w:pPr>
+        <w:rPr>
+          <w:sz w:val="22"/>
+          <w:szCs w:val="22"/>
+        </w:rPr>
+      </w:pPr>
+      <w:r>
+        <w:rPr>
+          <w:sz w:val="22"/>
+          <w:szCs w:val="22"/>
+        </w:rPr>
+        <w:t>==4769==    at 0x109345: test1 (memory-bugs.c:46)</w:t>
+      </w:r>
+    </w:p>
+    <w:p>
+      <w:pPr>
+        <w:rPr>
+          <w:sz w:val="22"/>
+          <w:szCs w:val="22"/>
+        </w:rPr>
+      </w:pPr>
+      <w:r>
+        <w:rPr>
+          <w:sz w:val="22"/>
+          <w:szCs w:val="22"/>
+        </w:rPr>
+        <w:t>==4769==    by 0x10953E: main (memory-bugs.c:92)</w:t>
+      </w:r>
+    </w:p>
+    <w:p>
+      <w:pPr>
+        <w:rPr>
+          <w:sz w:val="22"/>
+          <w:szCs w:val="22"/>
+        </w:rPr>
+      </w:pPr>
+      <w:r>
+        <w:rPr>
+          <w:sz w:val="22"/>
+          <w:szCs w:val="22"/>
+        </w:rPr>
+        <w:t xml:space="preserve">==4769==  Address 0x4a8c050 is 0 bytes after a block of size 16 </w:t>
+      </w:r>
+      <w:proofErr w:type="spellStart"/>
+      <w:r>
+        <w:rPr>
+          <w:sz w:val="22"/>
+          <w:szCs w:val="22"/>
+        </w:rPr>
+        <w:t>alloc'd</w:t>
+      </w:r>
+      <w:proofErr w:type="spellEnd"/>
+    </w:p>
+    <w:p>
+      <w:pPr>
+        <w:rPr>
+          <w:sz w:val="22"/>
+          <w:szCs w:val="22"/>
+        </w:rPr>
+      </w:pPr>
+    </w:p>
+    <w:p>
+      <w:pPr>
+        <w:rPr>
+          <w:sz w:val="22"/>
+          <w:szCs w:val="22"/>
+        </w:rPr>
+      </w:pPr>
+      <w:r>
+        <w:rPr>
+          <w:sz w:val="22"/>
+          <w:szCs w:val="22"/>
+        </w:rPr>
+        <w:t>Test 2:</w:t>
+      </w:r>
+    </w:p>
+    <w:p>
+      <w:pPr>
+        <w:rPr>
+          <w:sz w:val="22"/>
+          <w:szCs w:val="22"/>
+        </w:rPr>
+      </w:pPr>
+      <w:r>
+        <w:rPr>
+          <w:sz w:val="22"/>
+          <w:szCs w:val="22"/>
+        </w:rPr>
+        <w:t xml:space="preserve">==35700== Conditional jump or move depends on </w:t>
+      </w:r>
+      <w:proofErr w:type="spellStart"/>
+      <w:r>
+        <w:rPr>
+          <w:sz w:val="22"/>
+          <w:szCs w:val="22"/>
+        </w:rPr>
+        <w:t>uninitialised</w:t>
+      </w:r>
+      <w:proofErr w:type="spellEnd"/>
+      <w:r>
+        <w:rPr>
+          <w:sz w:val="22"/>
+          <w:szCs w:val="22"/>
+        </w:rPr>
+        <w:t xml:space="preserve"> value(s)</w:t>
+      </w:r>
+    </w:p>
+    <w:p>
+      <w:pPr>
+        <w:rPr>
+          <w:sz w:val="22"/>
+          <w:szCs w:val="22"/>
+        </w:rPr>
+      </w:pPr>
+      <w:r>
+        <w:rPr>
+          <w:sz w:val="22"/>
+          <w:szCs w:val="22"/>
+        </w:rPr>
+        <w:t>==35700==    at 0x48D6A96: __</w:t>
+      </w:r>
+      <w:proofErr w:type="spellStart"/>
+      <w:r>
+        <w:rPr>
+          <w:sz w:val="22"/>
+          <w:szCs w:val="22"/>
+        </w:rPr>
+        <w:t>vfprintf_internal</w:t>
+      </w:r>
+      <w:proofErr w:type="spellEnd"/>
+      <w:r>
+        <w:rPr>
+          <w:sz w:val="22"/>
+          <w:szCs w:val="22"/>
+        </w:rPr>
+        <w:t xml:space="preserve"> (vfprintf-internal.c:1516)</w:t>
+      </w:r>
+    </w:p>
+    <w:p>
+      <w:pPr>
+        <w:rPr>
+          <w:sz w:val="22"/>
+          <w:szCs w:val="22"/>
+        </w:rPr>
+      </w:pPr>
+      <w:r>
+        <w:rPr>
+          <w:sz w:val="22"/>
+          <w:szCs w:val="22"/>
+        </w:rPr>
+        <w:t xml:space="preserve">==35700==    by 0x48C079E: </w:t>
+      </w:r>
+      <w:proofErr w:type="spellStart"/>
+      <w:r>
+        <w:rPr>
+          <w:sz w:val="22"/>
+          <w:szCs w:val="22"/>
+        </w:rPr>
+        <w:t>printf</w:t>
+      </w:r>
+      <w:proofErr w:type="spellEnd"/>
+      <w:r>
+        <w:rPr>
+          <w:sz w:val="22"/>
+          <w:szCs w:val="22"/>
+        </w:rPr>
+        <w:t xml:space="preserve"> (printf.c:33)</w:t>
+      </w:r>
+    </w:p>
+    <w:p>
+      <w:pPr>
+        <w:rPr>
+          <w:sz w:val="22"/>
+          <w:szCs w:val="22"/>
+        </w:rPr>
+      </w:pPr>
+      <w:r>
+        <w:rPr>
+          <w:sz w:val="22"/>
+          <w:szCs w:val="22"/>
+        </w:rPr>
+        <w:t>==35700==    by 0x109419: test2 (memory-bugs.c:60)</w:t>
+      </w:r>
+    </w:p>
+    <w:p>
+      <w:pPr>
+        <w:rPr>
+          <w:sz w:val="22"/>
+          <w:szCs w:val="22"/>
+        </w:rPr>
+      </w:pPr>
+      <w:r>
+        <w:rPr>
+          <w:sz w:val="22"/>
+          <w:szCs w:val="22"/>
+        </w:rPr>
+        <w:lastRenderedPageBreak/>
+        <w:t>==35700==    by 0x109545: main (memory-bugs.c:93)</w:t>
+      </w:r>
+    </w:p>
+    <w:p>
+      <w:pPr>
+        <w:rPr>
+          <w:sz w:val="22"/>
+          <w:szCs w:val="22"/>
+        </w:rPr>
+      </w:pPr>
+      <w:r>
+        <w:rPr>
+          <w:sz w:val="22"/>
+          <w:szCs w:val="22"/>
+        </w:rPr>
+        <w:t xml:space="preserve">==35700==  </w:t>
+      </w:r>
+      <w:proofErr w:type="spellStart"/>
+      <w:r>
+        <w:rPr>
+          <w:sz w:val="22"/>
+          <w:szCs w:val="22"/>
+        </w:rPr>
+        <w:t>Uninitialised</w:t>
+      </w:r>
+      <w:proofErr w:type="spellEnd"/>
+      <w:r>
+        <w:rPr>
+          <w:sz w:val="22"/>
+          <w:szCs w:val="22"/>
+        </w:rPr>
+        <w:t xml:space="preserve"> value was created by a heap allocation</w:t>
+      </w:r>
+    </w:p>
+    <w:p>
+      <w:pPr>
+        <w:rPr>
+          <w:sz w:val="22"/>
+          <w:szCs w:val="22"/>
+        </w:rPr>
+      </w:pPr>
+    </w:p>
+    <w:p>
+      <w:pPr>
+        <w:rPr>
+          <w:sz w:val="22"/>
+          <w:szCs w:val="22"/>
+        </w:rPr>
+      </w:pPr>
+      <w:r>
+        <w:rPr>
+          <w:sz w:val="22"/>
+          <w:szCs w:val="22"/>
+        </w:rPr>
+        <w:t>Test 3:</w:t>
+      </w:r>
+    </w:p>
+    <w:p>
+      <w:pPr>
+        <w:rPr>
+          <w:sz w:val="22"/>
+          <w:szCs w:val="22"/>
+        </w:rPr>
+      </w:pPr>
+      <w:r>
+        <w:rPr>
+          <w:sz w:val="22"/>
+          <w:szCs w:val="22"/>
+        </w:rPr>
+        <w:t>==35856== Invalid read of size 4</w:t>
+      </w:r>
+    </w:p>
+    <w:p>
+      <w:pPr>
+        <w:rPr>
+          <w:sz w:val="22"/>
+          <w:szCs w:val="22"/>
+        </w:rPr>
+      </w:pPr>
+      <w:r>
+        <w:rPr>
+          <w:sz w:val="22"/>
+          <w:szCs w:val="22"/>
+        </w:rPr>
+        <w:t>==35856==    at 0x10946E: test3 (memory-bugs.c:72)</w:t>
+      </w:r>
+    </w:p>
+    <w:p>
+      <w:pPr>
+        <w:rPr>
+          <w:sz w:val="22"/>
+          <w:szCs w:val="22"/>
+        </w:rPr>
+      </w:pPr>
+      <w:r>
+        <w:rPr>
+          <w:sz w:val="22"/>
+          <w:szCs w:val="22"/>
+        </w:rPr>
+        <w:t>==35856==    by 0x10954C: main (memory-bugs.c:94)</w:t>
+      </w:r>
+    </w:p>
+    <w:p>
+      <w:pPr>
+        <w:rPr>
+          <w:sz w:val="22"/>
+          <w:szCs w:val="22"/>
+        </w:rPr>
+      </w:pPr>
+      <w:r>
+        <w:rPr>
+          <w:sz w:val="22"/>
+          <w:szCs w:val="22"/>
+        </w:rPr>
+        <w:t xml:space="preserve">==35856==  Address 0x4a8c040 is 0 bytes inside a block of size 4 </w:t>
+      </w:r>
+      <w:proofErr w:type="spellStart"/>
+      <w:r>
+        <w:rPr>
+          <w:sz w:val="22"/>
+          <w:szCs w:val="22"/>
+        </w:rPr>
+        <w:t>free'd</w:t>
+      </w:r>
+      <w:proofErr w:type="spellEnd"/>
+    </w:p>
+    <w:p>
+      <w:pPr>
+        <w:rPr>
+          <w:sz w:val="22"/>
+          <w:szCs w:val="22"/>
+        </w:rPr>
+      </w:pPr>
+    </w:p>
+    <w:p>
+      <w:pPr>
+        <w:rPr>
+          <w:sz w:val="22"/>
+          <w:szCs w:val="22"/>
+        </w:rPr>
+      </w:pPr>
+      <w:r>
+        <w:rPr>
+          <w:sz w:val="22"/>
+          <w:szCs w:val="22"/>
+        </w:rPr>
+        <w:t>Test 4:</w:t>
+      </w:r>
+    </w:p>
+    <w:p>
+      <w:pPr>
+        <w:rPr>
+          <w:sz w:val="22"/>
+          <w:szCs w:val="22"/>
+        </w:rPr>
+      </w:pPr>
+      <w:r>
+        <w:rPr>
+          <w:sz w:val="22"/>
+          <w:szCs w:val="22"/>
+        </w:rPr>
+        <w:t>==35944== LEAK SUMMARY:</w:t>
+      </w:r>
+    </w:p>
+    <w:p>
+      <w:pPr>
+        <w:rPr>
+          <w:sz w:val="22"/>
+          <w:szCs w:val="22"/>
+        </w:rPr>
+      </w:pPr>
+      <w:r>
+        <w:rPr>
+          <w:sz w:val="22"/>
+          <w:szCs w:val="22"/>
+        </w:rPr>
+        <w:t>==35944==    definitely lost: 64 bytes in 1 blocks</w:t>
+      </w:r>
     </w:p>
     <w:sectPr>
       <w:pgSz w:w="12240" w:h="15840"/>
@@ -1205,6 +1476,56 @@
     </w:sectPr>
   </w:body>
 </w:document>
+</file>
+
+<file path=word/endnotes.xml><?xml version="1.0" encoding="utf-8"?>
+<w:endnotes xmlns:wpc="http://schemas.microsoft.com/office/word/2010/wordprocessingCanvas" xmlns:cx="http://schemas.microsoft.com/office/drawing/2014/chartex" xmlns:cx1="http://schemas.microsoft.com/office/drawing/2015/9/8/chartex" xmlns:cx2="http://schemas.microsoft.com/office/drawing/2015/10/21/chartex" xmlns:cx3="http://schemas.microsoft.com/office/drawing/2016/5/9/chartex" xmlns:cx4="http://schemas.microsoft.com/office/drawing/2016/5/10/chartex" xmlns:cx5="http://schemas.microsoft.com/office/drawing/2016/5/11/chartex" xmlns:cx6="http://schemas.microsoft.com/office/drawing/2016/5/12/chartex" xmlns:cx7="http://schemas.microsoft.com/office/drawing/2016/5/13/chartex" xmlns:cx8="http://schemas.microsoft.com/office/drawing/2016/5/14/chartex" xmlns:mc="http://schemas.openxmlformats.org/markup-compatibility/2006" xmlns:aink="http://schemas.microsoft.com/office/drawing/2016/ink" xmlns:am3d="http://schemas.microsoft.com/office/drawing/2017/model3d" xmlns:o="urn:schemas-microsoft-com:office:office" xmlns:oel="http://schemas.microsoft.com/office/2019/extlst" xmlns:r="http://schemas.openxmlformats.org/officeDocument/2006/relationships" xmlns:m="http://schemas.openxmlformats.org/officeDocument/2006/math" xmlns:v="urn:schemas-microsoft-com:vml" xmlns:wp14="http://schemas.microsoft.com/office/word/2010/wordprocessingDrawing" xmlns:wp="http://schemas.openxmlformats.org/drawingml/2006/wordprocessingDrawing" xmlns:w10="urn:schemas-microsoft-com:office:word" xmlns:w="http://schemas.openxmlformats.org/wordprocessingml/2006/main" xmlns:w14="http://schemas.microsoft.com/office/word/2010/wordml" xmlns:w15="http://schemas.microsoft.com/office/word/2012/wordml" xmlns:w16cex="http://schemas.microsoft.com/office/word/2018/wordml/cex" xmlns:w16cid="http://schemas.microsoft.com/office/word/2016/wordml/cid" xmlns:w16="http://schemas.microsoft.com/office/word/2018/wordml" xmlns:w16du="http://schemas.microsoft.com/office/word/2023/wordml/word16du" xmlns:w16sdtdh="http://schemas.microsoft.com/office/word/2020/wordml/sdtdatahash" xmlns:w16sdtfl="http://schemas.microsoft.com/office/word/2024/wordml/sdtformatlock" xmlns:w16se="http://schemas.microsoft.com/office/word/2015/wordml/symex" xmlns:wpg="http://schemas.microsoft.com/office/word/2010/wordprocessingGroup" xmlns:wpi="http://schemas.microsoft.com/office/word/2010/wordprocessingInk" xmlns:wne="http://schemas.microsoft.com/office/word/2006/wordml" xmlns:wps="http://schemas.microsoft.com/office/word/2010/wordprocessingShape" mc:Ignorable="w14 w15 w16se w16cid w16 w16cex w16sdtdh w16sdtfl w16du wp14">
+  <w:endnote w:type="separator" w:id="-1">
+    <w:p>
+      <w:pPr>
+        <w:spacing w:after="0" w:line="240" w:lineRule="auto"/>
+      </w:pPr>
+      <w:r>
+        <w:separator/>
+      </w:r>
+    </w:p>
+  </w:endnote>
+  <w:endnote w:type="continuationSeparator" w:id="0">
+    <w:p>
+      <w:pPr>
+        <w:spacing w:after="0" w:line="240" w:lineRule="auto"/>
+      </w:pPr>
+      <w:r>
+        <w:continuationSeparator/>
+      </w:r>
+    </w:p>
+  </w:endnote>
+</w:endnotes>
+</file>
+
+<file path=word/footnotes.xml><?xml version="1.0" encoding="utf-8"?>
+<w:footnotes xmlns:wpc="http://schemas.microsoft.com/office/word/2010/wordprocessingCanvas" xmlns:cx="http://schemas.microsoft.com/office/drawing/2014/chartex" xmlns:cx1="http://schemas.microsoft.com/office/drawing/2015/9/8/chartex" xmlns:cx2="http://schemas.microsoft.com/office/drawing/2015/10/21/chartex" xmlns:cx3="http://schemas.microsoft.com/office/drawing/2016/5/9/chartex" xmlns:cx4="http://schemas.microsoft.com/office/drawing/2016/5/10/chartex" xmlns:cx5="http://schemas.microsoft.com/office/drawing/2016/5/11/chartex" xmlns:cx6="http://schemas.microsoft.com/office/drawing/2016/5/12/chartex" xmlns:cx7="http://schemas.microsoft.com/office/drawing/2016/5/13/chartex" xmlns:cx8="http://schemas.microsoft.com/office/drawing/2016/5/14/chartex" xmlns:mc="http://schemas.openxmlformats.org/markup-compatibility/2006" xmlns:aink="http://schemas.microsoft.com/office/drawing/2016/ink" xmlns:am3d="http://schemas.microsoft.com/office/drawing/2017/model3d" xmlns:o="urn:schemas-microsoft-com:office:office" xmlns:oel="http://schemas.microsoft.com/office/2019/extlst" xmlns:r="http://schemas.openxmlformats.org/officeDocument/2006/relationships" xmlns:m="http://schemas.openxmlformats.org/officeDocument/2006/math" xmlns:v="urn:schemas-microsoft-com:vml" xmlns:wp14="http://schemas.microsoft.com/office/word/2010/wordprocessingDrawing" xmlns:wp="http://schemas.openxmlformats.org/drawingml/2006/wordprocessingDrawing" xmlns:w10="urn:schemas-microsoft-com:office:word" xmlns:w="http://schemas.openxmlformats.org/wordprocessingml/2006/main" xmlns:w14="http://schemas.microsoft.com/office/word/2010/wordml" xmlns:w15="http://schemas.microsoft.com/office/word/2012/wordml" xmlns:w16cex="http://schemas.microsoft.com/office/word/2018/wordml/cex" xmlns:w16cid="http://schemas.microsoft.com/office/word/2016/wordml/cid" xmlns:w16="http://schemas.microsoft.com/office/word/2018/wordml" xmlns:w16du="http://schemas.microsoft.com/office/word/2023/wordml/word16du" xmlns:w16sdtdh="http://schemas.microsoft.com/office/word/2020/wordml/sdtdatahash" xmlns:w16sdtfl="http://schemas.microsoft.com/office/word/2024/wordml/sdtformatlock" xmlns:w16se="http://schemas.microsoft.com/office/word/2015/wordml/symex" xmlns:wpg="http://schemas.microsoft.com/office/word/2010/wordprocessingGroup" xmlns:wpi="http://schemas.microsoft.com/office/word/2010/wordprocessingInk" xmlns:wne="http://schemas.microsoft.com/office/word/2006/wordml" xmlns:wps="http://schemas.microsoft.com/office/word/2010/wordprocessingShape" mc:Ignorable="w14 w15 w16se w16cid w16 w16cex w16sdtdh w16sdtfl w16du wp14">
+  <w:footnote w:type="separator" w:id="-1">
+    <w:p>
+      <w:pPr>
+        <w:spacing w:after="0" w:line="240" w:lineRule="auto"/>
+      </w:pPr>
+      <w:r>
+        <w:separator/>
+      </w:r>
+    </w:p>
+  </w:footnote>
+  <w:footnote w:type="continuationSeparator" w:id="0">
+    <w:p>
+      <w:pPr>
+        <w:spacing w:after="0" w:line="240" w:lineRule="auto"/>
+      </w:pPr>
+      <w:r>
+        <w:continuationSeparator/>
+      </w:r>
+    </w:p>
+  </w:footnote>
+</w:footnotes>
 </file>
 
 <file path=word/styles.xml><?xml version="1.0" encoding="utf-8"?>
@@ -2143,6 +2464,50 @@
       </w:tblBorders>
     </w:tblPr>
   </w:style>
+  <w:style w:type="paragraph" w:styleId="Header">
+    <w:name w:val="header"/>
+    <w:basedOn w:val="Normal"/>
+    <w:link w:val="HeaderChar"/>
+    <w:uiPriority w:val="99"/>
+    <w:unhideWhenUsed/>
+    <w:rsid w:val="00D25ABA"/>
+    <w:pPr>
+      <w:tabs>
+        <w:tab w:val="center" w:pos="4680"/>
+        <w:tab w:val="right" w:pos="9360"/>
+      </w:tabs>
+      <w:spacing w:after="0" w:line="240" w:lineRule="auto"/>
+    </w:pPr>
+  </w:style>
+  <w:style w:type="character" w:customStyle="1" w:styleId="HeaderChar">
+    <w:name w:val="Header Char"/>
+    <w:basedOn w:val="DefaultParagraphFont"/>
+    <w:link w:val="Header"/>
+    <w:uiPriority w:val="99"/>
+    <w:rsid w:val="00D25ABA"/>
+  </w:style>
+  <w:style w:type="paragraph" w:styleId="Footer">
+    <w:name w:val="footer"/>
+    <w:basedOn w:val="Normal"/>
+    <w:link w:val="FooterChar"/>
+    <w:uiPriority w:val="99"/>
+    <w:unhideWhenUsed/>
+    <w:rsid w:val="00D25ABA"/>
+    <w:pPr>
+      <w:tabs>
+        <w:tab w:val="center" w:pos="4680"/>
+        <w:tab w:val="right" w:pos="9360"/>
+      </w:tabs>
+      <w:spacing w:after="0" w:line="240" w:lineRule="auto"/>
+    </w:pPr>
+  </w:style>
+  <w:style w:type="character" w:customStyle="1" w:styleId="FooterChar">
+    <w:name w:val="Footer Char"/>
+    <w:basedOn w:val="DefaultParagraphFont"/>
+    <w:link w:val="Footer"/>
+    <w:uiPriority w:val="99"/>
+    <w:rsid w:val="00D25ABA"/>
+  </w:style>
 </w:styles>
 </file>
 

</xml_diff>